<commit_message>
feat: update roadmap and architecture documents to emphasize MVP requirements and admin app integration
</commit_message>
<xml_diff>
--- a/docs/Human_Healthspan_AI_Scientific_Network_Blueprint.docx
+++ b/docs/Human_Healthspan_AI_Scientific_Network_Blueprint.docx
@@ -3389,6 +3389,14 @@
         <w:t>23. Phased Roadmap</w:t>
       </w:r>
     </w:p>
+    <w:p>
+      <w:r>
+        <w:rPr>
+          <w:b/>
+        </w:rPr>
+        <w:t>Roadmap principle: The Admin App is a required first-class application in the MVP, not a later add-on. The separate admin frontend shares the platform API and domain services, while using stricter authentication, authorization and audit controls. Advanced institutional and AI-governance capabilities can follow in later phases.</w:t>
+      </w:r>
+    </w:p>
     <w:tbl>
       <w:tblPr>
         <w:tblStyle w:val="TableGrid"/>
@@ -3406,11 +3414,6 @@
             <w:tcW w:w="3312" w:type="dxa"/>
           </w:tcPr>
           <w:p>
-            <w:pPr>
-              <w:rPr>
-                <w:rFonts w:hint="eastAsia"/>
-              </w:rPr>
-            </w:pPr>
             <w:r>
               <w:t>Phase</w:t>
             </w:r>
@@ -3421,11 +3424,6 @@
             <w:tcW w:w="3312" w:type="dxa"/>
           </w:tcPr>
           <w:p>
-            <w:pPr>
-              <w:rPr>
-                <w:rFonts w:hint="eastAsia"/>
-              </w:rPr>
-            </w:pPr>
             <w:r>
               <w:t>Focus</w:t>
             </w:r>
@@ -3436,11 +3434,6 @@
             <w:tcW w:w="3312" w:type="dxa"/>
           </w:tcPr>
           <w:p>
-            <w:pPr>
-              <w:rPr>
-                <w:rFonts w:hint="eastAsia"/>
-              </w:rPr>
-            </w:pPr>
             <w:r>
               <w:t>Major outcomes</w:t>
             </w:r>
@@ -3450,46 +3443,31 @@
       <w:tr>
         <w:tc>
           <w:tcPr>
-            <w:tcW w:w="3312" w:type="dxa"/>
+            <w:tcW w:type="dxa" w:w="3312"/>
           </w:tcPr>
           <w:p>
-            <w:pPr>
-              <w:rPr>
-                <w:rFonts w:hint="eastAsia"/>
-              </w:rPr>
-            </w:pPr>
             <w:r>
-              <w:t>0 — Validation</w:t>
+              <w:t>0 — Validation &amp; Architecture</w:t>
             </w:r>
           </w:p>
         </w:tc>
         <w:tc>
           <w:tcPr>
-            <w:tcW w:w="3312" w:type="dxa"/>
+            <w:tcW w:type="dxa" w:w="3312"/>
           </w:tcPr>
           <w:p>
-            <w:pPr>
-              <w:rPr>
-                <w:rFonts w:hint="eastAsia"/>
-              </w:rPr>
-            </w:pPr>
             <w:r>
-              <w:t>Interviews, positioning, prototype</w:t>
+              <w:t>Interviews, positioning, prototype, shared foundation and Admin App design</w:t>
             </w:r>
           </w:p>
         </w:tc>
         <w:tc>
           <w:tcPr>
-            <w:tcW w:w="3312" w:type="dxa"/>
+            <w:tcW w:type="dxa" w:w="3312"/>
           </w:tcPr>
           <w:p>
-            <w:pPr>
-              <w:rPr>
-                <w:rFonts w:hint="eastAsia"/>
-              </w:rPr>
-            </w:pPr>
             <w:r>
-              <w:t>Confirm strongest user problems</w:t>
+              <w:t>Validate core user problems; define admin roles, permissions, audit events, moderation and scientific-review workflows.</w:t>
             </w:r>
           </w:p>
         </w:tc>
@@ -3497,14 +3475,9 @@
       <w:tr>
         <w:tc>
           <w:tcPr>
-            <w:tcW w:w="3312" w:type="dxa"/>
+            <w:tcW w:type="dxa" w:w="3312"/>
           </w:tcPr>
           <w:p>
-            <w:pPr>
-              <w:rPr>
-                <w:rFonts w:hint="eastAsia"/>
-              </w:rPr>
-            </w:pPr>
             <w:r>
               <w:t>1 — MVP</w:t>
             </w:r>
@@ -3512,31 +3485,21 @@
         </w:tc>
         <w:tc>
           <w:tcPr>
-            <w:tcW w:w="3312" w:type="dxa"/>
+            <w:tcW w:type="dxa" w:w="3312"/>
           </w:tcPr>
           <w:p>
-            <w:pPr>
-              <w:rPr>
-                <w:rFonts w:hint="eastAsia"/>
-              </w:rPr>
-            </w:pPr>
             <w:r>
-              <w:t>Social + profiles + communities + research workspace + AI Q&amp;A</w:t>
+              <w:t>Social + profiles + communities + foundational research workspace + AI Q&amp;A + dedicated Admin App</w:t>
             </w:r>
           </w:p>
         </w:tc>
         <w:tc>
           <w:tcPr>
-            <w:tcW w:w="3312" w:type="dxa"/>
+            <w:tcW w:type="dxa" w:w="3312"/>
           </w:tcPr>
           <w:p>
-            <w:pPr>
-              <w:rPr>
-                <w:rFonts w:hint="eastAsia"/>
-              </w:rPr>
-            </w:pPr>
             <w:r>
-              <w:t>Prove engagement and utility</w:t>
+              <w:t>Prove engagement and utility. Admin App is required for launch: secure admin access, RBAC, dashboard, user/account management, moderation queue, basic scientific review, audit logs and operational job/health visibility.</w:t>
             </w:r>
           </w:p>
         </w:tc>
@@ -3544,46 +3507,31 @@
       <w:tr>
         <w:tc>
           <w:tcPr>
-            <w:tcW w:w="3312" w:type="dxa"/>
+            <w:tcW w:type="dxa" w:w="3312"/>
           </w:tcPr>
           <w:p>
-            <w:pPr>
-              <w:rPr>
-                <w:rFonts w:hint="eastAsia"/>
-              </w:rPr>
-            </w:pPr>
             <w:r>
-              <w:t>2 — Knowledge</w:t>
+              <w:t>2 — Knowledge &amp; Governance</w:t>
             </w:r>
           </w:p>
         </w:tc>
         <w:tc>
           <w:tcPr>
-            <w:tcW w:w="3312" w:type="dxa"/>
+            <w:tcW w:type="dxa" w:w="3312"/>
           </w:tcPr>
           <w:p>
-            <w:pPr>
-              <w:rPr>
-                <w:rFonts w:hint="eastAsia"/>
-              </w:rPr>
-            </w:pPr>
             <w:r>
-              <w:t>Scientific search + evidence layer + knowledge graph</w:t>
+              <w:t>Scientific search + evidence/provenance layer + knowledge graph foundations + governance workflows</w:t>
             </w:r>
           </w:p>
         </w:tc>
         <w:tc>
           <w:tcPr>
-            <w:tcW w:w="3312" w:type="dxa"/>
+            <w:tcW w:type="dxa" w:w="3312"/>
           </w:tcPr>
           <w:p>
-            <w:pPr>
-              <w:rPr>
-                <w:rFonts w:hint="eastAsia"/>
-              </w:rPr>
-            </w:pPr>
             <w:r>
-              <w:t>Improve research discovery</w:t>
+              <w:t>Improve research discovery; mature evidence review, correction/retraction, privacy requests, access reviews and moderation analytics.</w:t>
             </w:r>
           </w:p>
         </w:tc>
@@ -3591,14 +3539,9 @@
       <w:tr>
         <w:tc>
           <w:tcPr>
-            <w:tcW w:w="3312" w:type="dxa"/>
+            <w:tcW w:type="dxa" w:w="3312"/>
           </w:tcPr>
           <w:p>
-            <w:pPr>
-              <w:rPr>
-                <w:rFonts w:hint="eastAsia"/>
-              </w:rPr>
-            </w:pPr>
             <w:r>
               <w:t>3 — Collaboration</w:t>
             </w:r>
@@ -3606,31 +3549,21 @@
         </w:tc>
         <w:tc>
           <w:tcPr>
-            <w:tcW w:w="3312" w:type="dxa"/>
+            <w:tcW w:type="dxa" w:w="3312"/>
           </w:tcPr>
           <w:p>
-            <w:pPr>
-              <w:rPr>
-                <w:rFonts w:hint="eastAsia"/>
-              </w:rPr>
-            </w:pPr>
             <w:r>
-              <w:t>Research matching + teams + events + challenges</w:t>
+              <w:t>Research matching + teams + events + challenges + admin workflow expansion</w:t>
             </w:r>
           </w:p>
         </w:tc>
         <w:tc>
           <w:tcPr>
-            <w:tcW w:w="3312" w:type="dxa"/>
+            <w:tcW w:type="dxa" w:w="3312"/>
           </w:tcPr>
           <w:p>
-            <w:pPr>
-              <w:rPr>
-                <w:rFonts w:hint="eastAsia"/>
-              </w:rPr>
-            </w:pPr>
             <w:r>
-              <w:t>Create network effects</w:t>
+              <w:t>Create network effects; administer events/challenges and improve abuse prevention and operational reporting.</w:t>
             </w:r>
           </w:p>
         </w:tc>
@@ -3638,46 +3571,31 @@
       <w:tr>
         <w:tc>
           <w:tcPr>
-            <w:tcW w:w="3312" w:type="dxa"/>
+            <w:tcW w:type="dxa" w:w="3312"/>
           </w:tcPr>
           <w:p>
-            <w:pPr>
-              <w:rPr>
-                <w:rFonts w:hint="eastAsia"/>
-              </w:rPr>
-            </w:pPr>
             <w:r>
-              <w:t>4 — Data/AI</w:t>
+              <w:t>4 — Data / AI Operations</w:t>
             </w:r>
           </w:p>
         </w:tc>
         <w:tc>
           <w:tcPr>
-            <w:tcW w:w="3312" w:type="dxa"/>
+            <w:tcW w:type="dxa" w:w="3312"/>
           </w:tcPr>
           <w:p>
-            <w:pPr>
-              <w:rPr>
-                <w:rFonts w:hint="eastAsia"/>
-              </w:rPr>
-            </w:pPr>
             <w:r>
-              <w:t>Advanced datasets, agents, analysis tools</w:t>
+              <w:t>Advanced datasets, AI agents, analysis tools and Admin AI oversight</w:t>
             </w:r>
           </w:p>
         </w:tc>
         <w:tc>
           <w:tcPr>
-            <w:tcW w:w="3312" w:type="dxa"/>
+            <w:tcW w:type="dxa" w:w="3312"/>
           </w:tcPr>
           <w:p>
-            <w:pPr>
-              <w:rPr>
-                <w:rFonts w:hint="eastAsia"/>
-              </w:rPr>
-            </w:pPr>
             <w:r>
-              <w:t>Increase scientific value</w:t>
+              <w:t>Increase scientific value with AI evaluation, citation/groundedness metrics, incident review and controlled configuration.</w:t>
             </w:r>
           </w:p>
         </w:tc>
@@ -3685,14 +3603,9 @@
       <w:tr>
         <w:tc>
           <w:tcPr>
-            <w:tcW w:w="3312" w:type="dxa"/>
+            <w:tcW w:type="dxa" w:w="3312"/>
           </w:tcPr>
           <w:p>
-            <w:pPr>
-              <w:rPr>
-                <w:rFonts w:hint="eastAsia"/>
-              </w:rPr>
-            </w:pPr>
             <w:r>
               <w:t>5 — Institutions</w:t>
             </w:r>
@@ -3700,31 +3613,21 @@
         </w:tc>
         <w:tc>
           <w:tcPr>
-            <w:tcW w:w="3312" w:type="dxa"/>
+            <w:tcW w:type="dxa" w:w="3312"/>
           </w:tcPr>
           <w:p>
-            <w:pPr>
-              <w:rPr>
-                <w:rFonts w:hint="eastAsia"/>
-              </w:rPr>
-            </w:pPr>
             <w:r>
-              <w:t>Enterprise/private research environments</w:t>
+              <w:t>Enterprise/private research environments + delegated organization administration</w:t>
             </w:r>
           </w:p>
         </w:tc>
         <w:tc>
           <w:tcPr>
-            <w:tcW w:w="3312" w:type="dxa"/>
+            <w:tcW w:type="dxa" w:w="3312"/>
           </w:tcPr>
           <w:p>
-            <w:pPr>
-              <w:rPr>
-                <w:rFonts w:hint="eastAsia"/>
-              </w:rPr>
-            </w:pPr>
             <w:r>
-              <w:t>Monetization and defensibility</w:t>
+              <w:t>Support institutions with tenant isolation, scoped admin roles, stronger governance and institutional audit reporting.</w:t>
             </w:r>
           </w:p>
         </w:tc>
@@ -3732,46 +3635,31 @@
       <w:tr>
         <w:tc>
           <w:tcPr>
-            <w:tcW w:w="3312" w:type="dxa"/>
+            <w:tcW w:type="dxa" w:w="3312"/>
           </w:tcPr>
           <w:p>
-            <w:pPr>
-              <w:rPr>
-                <w:rFonts w:hint="eastAsia"/>
-              </w:rPr>
-            </w:pPr>
             <w:r>
-              <w:t>6 — Global ecosystem</w:t>
+              <w:t>6 — Global Ecosystem</w:t>
             </w:r>
           </w:p>
         </w:tc>
         <w:tc>
           <w:tcPr>
-            <w:tcW w:w="3312" w:type="dxa"/>
+            <w:tcW w:type="dxa" w:w="3312"/>
           </w:tcPr>
           <w:p>
-            <w:pPr>
-              <w:rPr>
-                <w:rFonts w:hint="eastAsia"/>
-              </w:rPr>
-            </w:pPr>
             <w:r>
-              <w:t>Funding, labs, APIs, research marketplace</w:t>
+              <w:t>Funding, labs, APIs, research marketplace and global operations</w:t>
             </w:r>
           </w:p>
         </w:tc>
         <w:tc>
           <w:tcPr>
-            <w:tcW w:w="3312" w:type="dxa"/>
+            <w:tcW w:type="dxa" w:w="3312"/>
           </w:tcPr>
           <w:p>
-            <w:pPr>
-              <w:rPr>
-                <w:rFonts w:hint="eastAsia"/>
-              </w:rPr>
-            </w:pPr>
             <w:r>
-              <w:t>Become infrastructure</w:t>
+              <w:t>Become global infrastructure with scalable governance and operational controls.</w:t>
             </w:r>
           </w:p>
         </w:tc>

</xml_diff>